<commit_message>
Part 1 Problem 3 - Facade pattern reinforcement in SMTP/IMAP/NNTP
</commit_message>
<xml_diff>
--- a/3.5-Software-Architecture-Final-Project.docx
+++ b/3.5-Software-Architecture-Final-Project.docx
@@ -4943,6 +4943,304 @@
     </w:p>
     <w:p>
       <w:pPr>
+        <w:pStyle w:val="Heading2"/>
+      </w:pPr>
+      <w:r>
+        <w:t>8c. Facade — Two-Tier Boundary Consistency</w:t>
+      </w:r>
+    </w:p>
+    <w:p>
+      <w:pPr>
+        <w:pStyle w:val="Heading3"/>
+      </w:pPr>
+      <w:r>
+        <w:t>The Pattern</w:t>
+      </w:r>
+    </w:p>
+    <w:p>
+      <w:pPr/>
+      <w:r>
+        <w:t>The Facade pattern (GoF Structural) provides a unified, simplified interface to a complex subsystem. In Apache Commons Net the canonical example is FTPClient sitting in front of FTP — FTP exposes the raw RFC 959 command layer (sendCommand, getReplyCode, control-stream readers and writers), and FTPClient hides every wire-level detail behind high-level operations such as login, retrieveFile, storeFile, and listFiles.</w:t>
+      </w:r>
+    </w:p>
+    <w:p>
+      <w:pPr>
+        <w:pStyle w:val="Heading3"/>
+      </w:pPr>
+      <w:r>
+        <w:t>Why This Pattern</w:t>
+      </w:r>
+    </w:p>
+    <w:p>
+      <w:pPr/>
+      <w:r>
+        <w:t>SMTPClient, IMAPClient, and NNTPClient already followed the two-tier structure in name, but the boundary between the two tiers was not enforced. High-level client methods reached into the protected control streams of the base class (_writer, _writer_, _reader_) to construct DotTerminatedMessageWriter and DotTerminatedMessageReader instances themselves, and IMAPClient.append inspected raw protocol reply codes (IMAPReply.isContinuation) and invoked sendData directly. Reinforcing the Facade boundary brings these three protocol clients into alignment with FTPClient: the base class owns all raw protocol I/O, and the client class only orchestrates high-level operations.</w:t>
+      </w:r>
+    </w:p>
+    <w:p>
+      <w:pPr>
+        <w:pStyle w:val="Heading3"/>
+      </w:pPr>
+      <w:r>
+        <w:t>Why Not Other Patterns</w:t>
+      </w:r>
+    </w:p>
+    <w:p>
+      <w:pPr>
+        <w:pStyle w:val="ListBullet"/>
+      </w:pPr>
+      <w:r>
+        <w:t>Adapter — assumes an interface mismatch to bridge; the two tiers here already speak compatible interfaces.</w:t>
+      </w:r>
+    </w:p>
+    <w:p>
+      <w:pPr>
+        <w:pStyle w:val="ListBullet"/>
+      </w:pPr>
+      <w:r>
+        <w:t>Mediator — assumes a peer-to-peer relationship between many components; SMTPClient/SMTP is a strict subclass hierarchy, not a peer relationship.</w:t>
+      </w:r>
+    </w:p>
+    <w:p>
+      <w:pPr>
+        <w:pStyle w:val="ListBullet"/>
+      </w:pPr>
+      <w:r>
+        <w:t>Decorator — would force every existing inheritance relationship (AuthenticatingSMTPClient, SMTPSClient, etc.) to be rewritten as composition, breaking binary and source compatibility for external callers.</w:t>
+      </w:r>
+    </w:p>
+    <w:p>
+      <w:pPr>
+        <w:pStyle w:val="ListBullet"/>
+      </w:pPr>
+      <w:r>
+        <w:t>Template Method — would invert control by having the base class drive a fixed algorithm; Facade keeps the client class as the entry point and the high-level operations across SMTP, IMAP, and NNTP are not variations of one shared algorithm.</w:t>
+      </w:r>
+    </w:p>
+    <w:p>
+      <w:pPr>
+        <w:pStyle w:val="ListBullet"/>
+      </w:pPr>
+      <w:r>
+        <w:t>Bridge — explicitly listed as out of scope by the project plan; the implementation side (one socket, one buffered reader, one buffered writer per connection) has no real variation to abstract.</w:t>
+      </w:r>
+    </w:p>
+    <w:p>
+      <w:pPr>
+        <w:pStyle w:val="Heading3"/>
+      </w:pPr>
+      <w:r>
+        <w:t>Components Needed</w:t>
+      </w:r>
+    </w:p>
+    <w:p>
+      <w:pPr>
+        <w:pStyle w:val="ListBullet"/>
+      </w:pPr>
+      <w:r>
+        <w:t>SMTP (base class) — new protected Writer getDataWriter() owns DotTerminatedMessageWriter construction for the DATA payload.</w:t>
+      </w:r>
+    </w:p>
+    <w:p>
+      <w:pPr>
+        <w:pStyle w:val="ListBullet"/>
+      </w:pPr>
+      <w:r>
+        <w:t>SMTPClient (facade) — sendMessageData() now calls getDataWriter() instead of accessing _writer directly.</w:t>
+      </w:r>
+    </w:p>
+    <w:p>
+      <w:pPr>
+        <w:pStyle w:val="ListBullet"/>
+      </w:pPr>
+      <w:r>
+        <w:t>IMAP (base class) — new public boolean appendWithData(String args, String message) handles the two-step APPEND continuation+literal exchange end-to-end.</w:t>
+      </w:r>
+    </w:p>
+    <w:p>
+      <w:pPr>
+        <w:pStyle w:val="ListBullet"/>
+      </w:pPr>
+      <w:r>
+        <w:t>IMAPClient (facade) — append() now delegates the two-step exchange to appendWithData().</w:t>
+      </w:r>
+    </w:p>
+    <w:p>
+      <w:pPr>
+        <w:pStyle w:val="ListBullet"/>
+      </w:pPr>
+      <w:r>
+        <w:t>NNTP (base class) — new protected BufferedReader openMessageReader() and protected Writer getDataWriter() own DotTerminatedMessageReader and DotTerminatedMessageWriter construction.</w:t>
+      </w:r>
+    </w:p>
+    <w:p>
+      <w:pPr>
+        <w:pStyle w:val="ListBullet"/>
+      </w:pPr>
+      <w:r>
+        <w:t>NNTPClient (facade) — __retrieve(), postArticle(), and forwardArticle() now use the new accessors instead of accessing _reader_ and _writer_ directly.</w:t>
+      </w:r>
+    </w:p>
+    <w:p>
+      <w:pPr>
+        <w:pStyle w:val="ListBullet"/>
+      </w:pPr>
+      <w:r>
+        <w:t>DotTerminatedMessageReader / DotTerminatedMessageWriter — unchanged stream wrappers, now constructed only inside the base classes.</w:t>
+      </w:r>
+    </w:p>
+    <w:p>
+      <w:pPr>
+        <w:pStyle w:val="Heading3"/>
+      </w:pPr>
+      <w:r>
+        <w:t>Pros and Cons</w:t>
+      </w:r>
+    </w:p>
+    <w:p>
+      <w:pPr/>
+      <w:r>
+        <w:t>Pros:</w:t>
+      </w:r>
+    </w:p>
+    <w:p>
+      <w:pPr>
+        <w:pStyle w:val="ListBullet"/>
+      </w:pPr>
+      <w:r>
+        <w:t>Architectural consistency with FTP — all four primary protocol clients (FTPClient, SMTPClient, IMAPClient, NNTPClient) now follow the same two-tier Facade contract.</w:t>
+      </w:r>
+    </w:p>
+    <w:p>
+      <w:pPr>
+        <w:pStyle w:val="ListBullet"/>
+      </w:pPr>
+      <w:r>
+        <w:t>Single source of truth for raw I/O — every dot-terminated reader and writer is now constructed in exactly one place per protocol.</w:t>
+      </w:r>
+    </w:p>
+    <w:p>
+      <w:pPr>
+        <w:pStyle w:val="ListBullet"/>
+      </w:pPr>
+      <w:r>
+        <w:t>No public API breakage — every modified public method keeps the same signature, return contract, and observable behavior. External callers do not need to change a single line.</w:t>
+      </w:r>
+    </w:p>
+    <w:p>
+      <w:pPr>
+        <w:pStyle w:val="ListBullet"/>
+      </w:pPr>
+      <w:r>
+        <w:t>Additive design — the new methods on the base classes are inherited automatically by AuthenticatingSMTPClient, SMTPSClient, IMAPSClient, AuthenticatingIMAPClient, and NNTPSClient with no further work.</w:t>
+      </w:r>
+    </w:p>
+    <w:p>
+      <w:pPr/>
+      <w:r>
+        <w:t>Cons:</w:t>
+      </w:r>
+    </w:p>
+    <w:p>
+      <w:pPr>
+        <w:pStyle w:val="ListBullet"/>
+      </w:pPr>
+      <w:r>
+        <w:t>Three base classes were modified — additions are small but the change is not confined to one file.</w:t>
+      </w:r>
+    </w:p>
+    <w:p>
+      <w:pPr>
+        <w:pStyle w:val="ListBullet"/>
+      </w:pPr>
+      <w:r>
+        <w:t>Some private NNTPClient parsing helpers still construct DotTerminatedMessageReader inline — intentionally left for the upcoming Factory + Strategy parser refactor to avoid a merge conflict.</w:t>
+      </w:r>
+    </w:p>
+    <w:p>
+      <w:pPr>
+        <w:pStyle w:val="ListBullet"/>
+      </w:pPr>
+      <w:r>
+        <w:t>No new user-visible feature — the benefit is design clarity and maintainability rather than new capability.</w:t>
+      </w:r>
+    </w:p>
+    <w:p>
+      <w:pPr>
+        <w:pStyle w:val="Heading3"/>
+      </w:pPr>
+      <w:r>
+        <w:t>Implementation</w:t>
+      </w:r>
+    </w:p>
+    <w:p>
+      <w:pPr/>
+      <w:r>
+        <w:t>The following files were changed:</w:t>
+      </w:r>
+    </w:p>
+    <w:p>
+      <w:pPr>
+        <w:pStyle w:val="ListBullet"/>
+      </w:pPr>
+      <w:r>
+        <w:t>SMTP.java — added imports for java.io.Writer and DotTerminatedMessageWriter; added protected Writer getDataWriter() that wraps _writer in a DotTerminatedMessageWriter.</w:t>
+      </w:r>
+    </w:p>
+    <w:p>
+      <w:pPr>
+        <w:pStyle w:val="ListBullet"/>
+      </w:pPr>
+      <w:r>
+        <w:t>SMTPClient.java — sendMessageData() now calls getDataWriter() instead of new DotTerminatedMessageWriter(_writer); the now-unused DotTerminatedMessageWriter import was removed.</w:t>
+      </w:r>
+    </w:p>
+    <w:p>
+      <w:pPr>
+        <w:pStyle w:val="ListBullet"/>
+      </w:pPr>
+      <w:r>
+        <w:t>IMAP.java — added public boolean appendWithData(String args, String message) that performs the full two-step APPEND wire exchange.</w:t>
+      </w:r>
+    </w:p>
+    <w:p>
+      <w:pPr>
+        <w:pStyle w:val="ListBullet"/>
+      </w:pPr>
+      <w:r>
+        <w:t>IMAPClient.java — append(String, String, String, String) now delegates the continuation+literal protocol to appendWithData() and no longer inspects raw reply codes itself.</w:t>
+      </w:r>
+    </w:p>
+    <w:p>
+      <w:pPr>
+        <w:pStyle w:val="ListBullet"/>
+      </w:pPr>
+      <w:r>
+        <w:t>NNTP.java — added imports for java.io.Writer, DotTerminatedMessageReader, and DotTerminatedMessageWriter; added protected BufferedReader openMessageReader() and protected Writer getDataWriter() at the end of the class.</w:t>
+      </w:r>
+    </w:p>
+    <w:p>
+      <w:pPr>
+        <w:pStyle w:val="ListBullet"/>
+      </w:pPr>
+      <w:r>
+        <w:t>NNTPClient.java — both __retrieve(...) overloads now return openMessageReader(); postArticle() and forwardArticle(...) now return getDataWriter(). Private parsing helpers and the remaining stream-wrapping inside other private helpers were intentionally left untouched; they are scoped to the Factory + Strategy parser refactor.</w:t>
+      </w:r>
+    </w:p>
+    <w:p>
+      <w:pPr/>
+      <w:r>
+        <w:t>No code already finalized for Problem 1 (command enums), Part 1 Problem 2 (Observer firing), Part 1 Problem 5 (SSL Template variants), Part 2 Builder, or Part 2 Singleton was modified.</w:t>
+      </w:r>
+    </w:p>
+    <w:p>
+      <w:pPr/>
+    </w:p>
+    <w:p>
+      <w:pPr/>
+    </w:p>
+    <w:p>
+      <w:pPr>
         <w:pStyle w:val="Heading1"/>
         <w:spacing w:before="280" w:after="80"/>
       </w:pPr>
@@ -5041,7 +5339,7 @@
           <w:color w:val="1F3D6B"/>
           <w:sz w:val="30"/>
         </w:rPr>
-        <w:t>Problem 2 — Facade Is Only Explicit in FTP</w:t>
+        <w:t>Problem 2 — Facade Is Only Explicit in FTP   ✅ DONE — see §8c</w:t>
       </w:r>
     </w:p>
     <w:p>

</xml_diff>